<commit_message>
feat: Implement all tasks 1 -10
</commit_message>
<xml_diff>
--- a/BaiTapDocker_NguyenXuanHo_DHKTPM18A.docx
+++ b/BaiTapDocker_NguyenXuanHo_DHKTPM18A.docx
@@ -5,6 +5,29 @@
     <w:p>
       <w:pPr>
         <w:ind w:left="0" w:firstLine="0"/>
+        <w:rPr>
+          <w:b/>
+          <w:sz w:val="60"/>
+          <w:szCs w:val="60"/>
+        </w:rPr>
+      </w:pPr>
+      <w:r>
+        <w:rPr>
+          <w:b/>
+          <w:sz w:val="60"/>
+          <w:szCs w:val="60"/>
+        </w:rPr>
+        <w:t>Bài 1:</w:t>
+      </w:r>
+    </w:p>
+    <w:p>
+      <w:pPr>
+        <w:ind w:left="0" w:firstLine="0"/>
+      </w:pPr>
+    </w:p>
+    <w:p>
+      <w:pPr>
+        <w:ind w:left="0" w:firstLine="0"/>
       </w:pPr>
       <w:r>
         <w:drawing>
@@ -23,7 +46,7 @@
                     <pic:cNvPicPr/>
                   </pic:nvPicPr>
                   <pic:blipFill>
-                    <a:blip r:embed="rId4"/>
+                    <a:blip r:embed="rId6"/>
                     <a:stretch>
                       <a:fillRect/>
                     </a:stretch>
@@ -65,7 +88,7 @@
                     <pic:cNvPicPr/>
                   </pic:nvPicPr>
                   <pic:blipFill>
-                    <a:blip r:embed="rId5"/>
+                    <a:blip r:embed="rId7"/>
                     <a:stretch>
                       <a:fillRect/>
                     </a:stretch>
@@ -107,7 +130,7 @@
                     <pic:cNvPicPr/>
                   </pic:nvPicPr>
                   <pic:blipFill>
-                    <a:blip r:embed="rId6"/>
+                    <a:blip r:embed="rId8"/>
                     <a:stretch>
                       <a:fillRect/>
                     </a:stretch>
@@ -150,7 +173,7 @@
                     <pic:cNvPicPr/>
                   </pic:nvPicPr>
                   <pic:blipFill>
-                    <a:blip r:embed="rId7"/>
+                    <a:blip r:embed="rId9"/>
                     <a:stretch>
                       <a:fillRect/>
                     </a:stretch>
@@ -192,7 +215,7 @@
                     <pic:cNvPicPr/>
                   </pic:nvPicPr>
                   <pic:blipFill>
-                    <a:blip r:embed="rId8"/>
+                    <a:blip r:embed="rId10"/>
                     <a:stretch>
                       <a:fillRect/>
                     </a:stretch>
@@ -235,7 +258,7 @@
                     <pic:cNvPicPr/>
                   </pic:nvPicPr>
                   <pic:blipFill>
-                    <a:blip r:embed="rId9"/>
+                    <a:blip r:embed="rId11"/>
                     <a:stretch>
                       <a:fillRect/>
                     </a:stretch>
@@ -277,7 +300,7 @@
                     <pic:cNvPicPr/>
                   </pic:nvPicPr>
                   <pic:blipFill>
-                    <a:blip r:embed="rId10"/>
+                    <a:blip r:embed="rId12"/>
                     <a:stretch>
                       <a:fillRect/>
                     </a:stretch>
@@ -319,7 +342,7 @@
                     <pic:cNvPicPr/>
                   </pic:nvPicPr>
                   <pic:blipFill>
-                    <a:blip r:embed="rId11"/>
+                    <a:blip r:embed="rId13"/>
                     <a:stretch>
                       <a:fillRect/>
                     </a:stretch>
@@ -362,7 +385,7 @@
                     <pic:cNvPicPr/>
                   </pic:nvPicPr>
                   <pic:blipFill>
-                    <a:blip r:embed="rId12"/>
+                    <a:blip r:embed="rId14"/>
                     <a:stretch>
                       <a:fillRect/>
                     </a:stretch>
@@ -404,7 +427,7 @@
                     <pic:cNvPicPr/>
                   </pic:nvPicPr>
                   <pic:blipFill>
-                    <a:blip r:embed="rId13"/>
+                    <a:blip r:embed="rId15"/>
                     <a:stretch>
                       <a:fillRect/>
                     </a:stretch>
@@ -447,7 +470,7 @@
                     <pic:cNvPicPr/>
                   </pic:nvPicPr>
                   <pic:blipFill>
-                    <a:blip r:embed="rId14"/>
+                    <a:blip r:embed="rId16"/>
                     <a:stretch>
                       <a:fillRect/>
                     </a:stretch>
@@ -489,7 +512,7 @@
                     <pic:cNvPicPr/>
                   </pic:nvPicPr>
                   <pic:blipFill>
-                    <a:blip r:embed="rId15"/>
+                    <a:blip r:embed="rId17"/>
                     <a:stretch>
                       <a:fillRect/>
                     </a:stretch>
@@ -532,7 +555,7 @@
                     <pic:cNvPicPr/>
                   </pic:nvPicPr>
                   <pic:blipFill>
-                    <a:blip r:embed="rId16"/>
+                    <a:blip r:embed="rId18"/>
                     <a:stretch>
                       <a:fillRect/>
                     </a:stretch>
@@ -557,6 +580,292 @@
       <w:pPr>
         <w:ind w:left="0" w:firstLine="0"/>
       </w:pPr>
+      <w:r>
+        <w:drawing>
+          <wp:inline distT="0" distB="0" distL="0" distR="0" wp14:anchorId="09D5E34B" wp14:editId="0BCF307A">
+            <wp:extent cx="5943600" cy="3948430"/>
+            <wp:effectExtent l="0" t="0" r="0" b="0"/>
+            <wp:docPr id="14" name="Picture 14"/>
+            <wp:cNvGraphicFramePr>
+              <a:graphicFrameLocks xmlns:a="http://schemas.openxmlformats.org/drawingml/2006/main" noChangeAspect="1"/>
+            </wp:cNvGraphicFramePr>
+            <a:graphic xmlns:a="http://schemas.openxmlformats.org/drawingml/2006/main">
+              <a:graphicData uri="http://schemas.openxmlformats.org/drawingml/2006/picture">
+                <pic:pic xmlns:pic="http://schemas.openxmlformats.org/drawingml/2006/picture">
+                  <pic:nvPicPr>
+                    <pic:cNvPr id="1" name=""/>
+                    <pic:cNvPicPr/>
+                  </pic:nvPicPr>
+                  <pic:blipFill>
+                    <a:blip r:embed="rId19"/>
+                    <a:stretch>
+                      <a:fillRect/>
+                    </a:stretch>
+                  </pic:blipFill>
+                  <pic:spPr>
+                    <a:xfrm>
+                      <a:off x="0" y="0"/>
+                      <a:ext cx="5943600" cy="3948430"/>
+                    </a:xfrm>
+                    <a:prstGeom prst="rect">
+                      <a:avLst/>
+                    </a:prstGeom>
+                  </pic:spPr>
+                </pic:pic>
+              </a:graphicData>
+            </a:graphic>
+          </wp:inline>
+        </w:drawing>
+      </w:r>
+    </w:p>
+    <w:p>
+      <w:pPr>
+        <w:ind w:left="0" w:firstLine="0"/>
+      </w:pPr>
+      <w:r>
+        <w:lastRenderedPageBreak/>
+        <w:drawing>
+          <wp:inline distT="0" distB="0" distL="0" distR="0" wp14:anchorId="74FC9382" wp14:editId="1C2BD96D">
+            <wp:extent cx="5943600" cy="3709035"/>
+            <wp:effectExtent l="0" t="0" r="0" b="5715"/>
+            <wp:docPr id="15" name="Picture 15"/>
+            <wp:cNvGraphicFramePr>
+              <a:graphicFrameLocks xmlns:a="http://schemas.openxmlformats.org/drawingml/2006/main" noChangeAspect="1"/>
+            </wp:cNvGraphicFramePr>
+            <a:graphic xmlns:a="http://schemas.openxmlformats.org/drawingml/2006/main">
+              <a:graphicData uri="http://schemas.openxmlformats.org/drawingml/2006/picture">
+                <pic:pic xmlns:pic="http://schemas.openxmlformats.org/drawingml/2006/picture">
+                  <pic:nvPicPr>
+                    <pic:cNvPr id="1" name=""/>
+                    <pic:cNvPicPr/>
+                  </pic:nvPicPr>
+                  <pic:blipFill>
+                    <a:blip r:embed="rId20"/>
+                    <a:stretch>
+                      <a:fillRect/>
+                    </a:stretch>
+                  </pic:blipFill>
+                  <pic:spPr>
+                    <a:xfrm>
+                      <a:off x="0" y="0"/>
+                      <a:ext cx="5943600" cy="3709035"/>
+                    </a:xfrm>
+                    <a:prstGeom prst="rect">
+                      <a:avLst/>
+                    </a:prstGeom>
+                  </pic:spPr>
+                </pic:pic>
+              </a:graphicData>
+            </a:graphic>
+          </wp:inline>
+        </w:drawing>
+      </w:r>
+    </w:p>
+    <w:p>
+      <w:pPr>
+        <w:ind w:left="0" w:firstLine="0"/>
+      </w:pPr>
+      <w:r>
+        <w:drawing>
+          <wp:inline distT="0" distB="0" distL="0" distR="0" wp14:anchorId="70C43D74" wp14:editId="3EAC42DF">
+            <wp:extent cx="5943600" cy="1981200"/>
+            <wp:effectExtent l="0" t="0" r="0" b="0"/>
+            <wp:docPr id="16" name="Picture 16"/>
+            <wp:cNvGraphicFramePr>
+              <a:graphicFrameLocks xmlns:a="http://schemas.openxmlformats.org/drawingml/2006/main" noChangeAspect="1"/>
+            </wp:cNvGraphicFramePr>
+            <a:graphic xmlns:a="http://schemas.openxmlformats.org/drawingml/2006/main">
+              <a:graphicData uri="http://schemas.openxmlformats.org/drawingml/2006/picture">
+                <pic:pic xmlns:pic="http://schemas.openxmlformats.org/drawingml/2006/picture">
+                  <pic:nvPicPr>
+                    <pic:cNvPr id="1" name=""/>
+                    <pic:cNvPicPr/>
+                  </pic:nvPicPr>
+                  <pic:blipFill>
+                    <a:blip r:embed="rId21"/>
+                    <a:stretch>
+                      <a:fillRect/>
+                    </a:stretch>
+                  </pic:blipFill>
+                  <pic:spPr>
+                    <a:xfrm>
+                      <a:off x="0" y="0"/>
+                      <a:ext cx="5943600" cy="1981200"/>
+                    </a:xfrm>
+                    <a:prstGeom prst="rect">
+                      <a:avLst/>
+                    </a:prstGeom>
+                  </pic:spPr>
+                </pic:pic>
+              </a:graphicData>
+            </a:graphic>
+          </wp:inline>
+        </w:drawing>
+      </w:r>
+    </w:p>
+    <w:p>
+      <w:pPr>
+        <w:ind w:left="0" w:firstLine="0"/>
+      </w:pPr>
+      <w:r>
+        <w:lastRenderedPageBreak/>
+        <w:drawing>
+          <wp:inline distT="0" distB="0" distL="0" distR="0" wp14:anchorId="5838C797" wp14:editId="19CB93E5">
+            <wp:extent cx="5943600" cy="3402330"/>
+            <wp:effectExtent l="0" t="0" r="0" b="7620"/>
+            <wp:docPr id="17" name="Picture 17"/>
+            <wp:cNvGraphicFramePr>
+              <a:graphicFrameLocks xmlns:a="http://schemas.openxmlformats.org/drawingml/2006/main" noChangeAspect="1"/>
+            </wp:cNvGraphicFramePr>
+            <a:graphic xmlns:a="http://schemas.openxmlformats.org/drawingml/2006/main">
+              <a:graphicData uri="http://schemas.openxmlformats.org/drawingml/2006/picture">
+                <pic:pic xmlns:pic="http://schemas.openxmlformats.org/drawingml/2006/picture">
+                  <pic:nvPicPr>
+                    <pic:cNvPr id="1" name=""/>
+                    <pic:cNvPicPr/>
+                  </pic:nvPicPr>
+                  <pic:blipFill>
+                    <a:blip r:embed="rId22"/>
+                    <a:stretch>
+                      <a:fillRect/>
+                    </a:stretch>
+                  </pic:blipFill>
+                  <pic:spPr>
+                    <a:xfrm>
+                      <a:off x="0" y="0"/>
+                      <a:ext cx="5943600" cy="3402330"/>
+                    </a:xfrm>
+                    <a:prstGeom prst="rect">
+                      <a:avLst/>
+                    </a:prstGeom>
+                  </pic:spPr>
+                </pic:pic>
+              </a:graphicData>
+            </a:graphic>
+          </wp:inline>
+        </w:drawing>
+      </w:r>
+    </w:p>
+    <w:p>
+      <w:pPr>
+        <w:ind w:left="0" w:firstLine="0"/>
+      </w:pPr>
+      <w:r>
+        <w:drawing>
+          <wp:inline distT="0" distB="0" distL="0" distR="0" wp14:anchorId="73639752" wp14:editId="3EACC49A">
+            <wp:extent cx="5943600" cy="2828925"/>
+            <wp:effectExtent l="0" t="0" r="0" b="9525"/>
+            <wp:docPr id="18" name="Picture 18"/>
+            <wp:cNvGraphicFramePr>
+              <a:graphicFrameLocks xmlns:a="http://schemas.openxmlformats.org/drawingml/2006/main" noChangeAspect="1"/>
+            </wp:cNvGraphicFramePr>
+            <a:graphic xmlns:a="http://schemas.openxmlformats.org/drawingml/2006/main">
+              <a:graphicData uri="http://schemas.openxmlformats.org/drawingml/2006/picture">
+                <pic:pic xmlns:pic="http://schemas.openxmlformats.org/drawingml/2006/picture">
+                  <pic:nvPicPr>
+                    <pic:cNvPr id="1" name=""/>
+                    <pic:cNvPicPr/>
+                  </pic:nvPicPr>
+                  <pic:blipFill>
+                    <a:blip r:embed="rId23"/>
+                    <a:stretch>
+                      <a:fillRect/>
+                    </a:stretch>
+                  </pic:blipFill>
+                  <pic:spPr>
+                    <a:xfrm>
+                      <a:off x="0" y="0"/>
+                      <a:ext cx="5943600" cy="2828925"/>
+                    </a:xfrm>
+                    <a:prstGeom prst="rect">
+                      <a:avLst/>
+                    </a:prstGeom>
+                  </pic:spPr>
+                </pic:pic>
+              </a:graphicData>
+            </a:graphic>
+          </wp:inline>
+        </w:drawing>
+      </w:r>
+    </w:p>
+    <w:p>
+      <w:pPr>
+        <w:ind w:left="0" w:firstLine="0"/>
+      </w:pPr>
+    </w:p>
+    <w:p>
+      <w:pPr>
+        <w:ind w:left="0" w:firstLine="0"/>
+      </w:pPr>
+      <w:r>
+        <w:lastRenderedPageBreak/>
+        <w:drawing>
+          <wp:inline distT="0" distB="0" distL="0" distR="0" wp14:anchorId="437737E6" wp14:editId="158EF9BB">
+            <wp:extent cx="5943600" cy="2686685"/>
+            <wp:effectExtent l="0" t="0" r="0" b="0"/>
+            <wp:docPr id="19" name="Picture 19"/>
+            <wp:cNvGraphicFramePr>
+              <a:graphicFrameLocks xmlns:a="http://schemas.openxmlformats.org/drawingml/2006/main" noChangeAspect="1"/>
+            </wp:cNvGraphicFramePr>
+            <a:graphic xmlns:a="http://schemas.openxmlformats.org/drawingml/2006/main">
+              <a:graphicData uri="http://schemas.openxmlformats.org/drawingml/2006/picture">
+                <pic:pic xmlns:pic="http://schemas.openxmlformats.org/drawingml/2006/picture">
+                  <pic:nvPicPr>
+                    <pic:cNvPr id="1" name=""/>
+                    <pic:cNvPicPr/>
+                  </pic:nvPicPr>
+                  <pic:blipFill>
+                    <a:blip r:embed="rId24"/>
+                    <a:stretch>
+                      <a:fillRect/>
+                    </a:stretch>
+                  </pic:blipFill>
+                  <pic:spPr>
+                    <a:xfrm>
+                      <a:off x="0" y="0"/>
+                      <a:ext cx="5943600" cy="2686685"/>
+                    </a:xfrm>
+                    <a:prstGeom prst="rect">
+                      <a:avLst/>
+                    </a:prstGeom>
+                  </pic:spPr>
+                </pic:pic>
+              </a:graphicData>
+            </a:graphic>
+          </wp:inline>
+        </w:drawing>
+      </w:r>
+    </w:p>
+    <w:p>
+      <w:pPr>
+        <w:ind w:left="0" w:firstLine="0"/>
+      </w:pPr>
+    </w:p>
+    <w:p>
+      <w:pPr>
+        <w:ind w:left="0" w:firstLine="0"/>
+        <w:rPr>
+          <w:b/>
+          <w:sz w:val="60"/>
+          <w:szCs w:val="60"/>
+        </w:rPr>
+      </w:pPr>
+      <w:r>
+        <w:rPr>
+          <w:b/>
+          <w:sz w:val="60"/>
+          <w:szCs w:val="60"/>
+        </w:rPr>
+        <w:t xml:space="preserve">Câu 2: </w:t>
+      </w:r>
+    </w:p>
+    <w:p>
+      <w:pPr>
+        <w:ind w:left="0" w:firstLine="0"/>
+      </w:pPr>
+      <w:r>
+        <w:t>-100 2000</w:t>
+      </w:r>
       <w:bookmarkStart w:id="0" w:name="_GoBack"/>
       <w:bookmarkEnd w:id="0"/>
     </w:p>
@@ -568,6 +877,56 @@
     </w:sectPr>
   </w:body>
 </w:document>
+</file>
+
+<file path=word/endnotes.xml><?xml version="1.0" encoding="utf-8"?>
+<w:endnotes xmlns:wpc="http://schemas.microsoft.com/office/word/2010/wordprocessingCanvas" xmlns:cx="http://schemas.microsoft.com/office/drawing/2014/chartex" xmlns:cx1="http://schemas.microsoft.com/office/drawing/2015/9/8/chartex" xmlns:cx2="http://schemas.microsoft.com/office/drawing/2015/10/21/chartex" xmlns:cx3="http://schemas.microsoft.com/office/drawing/2016/5/9/chartex" xmlns:cx4="http://schemas.microsoft.com/office/drawing/2016/5/10/chartex" xmlns:cx5="http://schemas.microsoft.com/office/drawing/2016/5/11/chartex" xmlns:cx6="http://schemas.microsoft.com/office/drawing/2016/5/12/chartex" xmlns:cx7="http://schemas.microsoft.com/office/drawing/2016/5/13/chartex" xmlns:cx8="http://schemas.microsoft.com/office/drawing/2016/5/14/chartex" xmlns:mc="http://schemas.openxmlformats.org/markup-compatibility/2006" xmlns:aink="http://schemas.microsoft.com/office/drawing/2016/ink" xmlns:am3d="http://schemas.microsoft.com/office/drawing/2017/model3d" xmlns:o="urn:schemas-microsoft-com:office:office" xmlns:r="http://schemas.openxmlformats.org/officeDocument/2006/relationships" xmlns:m="http://schemas.openxmlformats.org/officeDocument/2006/math" xmlns:v="urn:schemas-microsoft-com:vml" xmlns:wp14="http://schemas.microsoft.com/office/word/2010/wordprocessingDrawing" xmlns:wp="http://schemas.openxmlformats.org/drawingml/2006/wordprocessingDrawing" xmlns:w10="urn:schemas-microsoft-com:office:word" xmlns:w="http://schemas.openxmlformats.org/wordprocessingml/2006/main" xmlns:w14="http://schemas.microsoft.com/office/word/2010/wordml" xmlns:w15="http://schemas.microsoft.com/office/word/2012/wordml" xmlns:w16cid="http://schemas.microsoft.com/office/word/2016/wordml/cid" xmlns:w16se="http://schemas.microsoft.com/office/word/2015/wordml/symex" xmlns:wpg="http://schemas.microsoft.com/office/word/2010/wordprocessingGroup" xmlns:wpi="http://schemas.microsoft.com/office/word/2010/wordprocessingInk" xmlns:wne="http://schemas.microsoft.com/office/word/2006/wordml" xmlns:wps="http://schemas.microsoft.com/office/word/2010/wordprocessingShape" mc:Ignorable="w14 w15 w16se w16cid wp14">
+  <w:endnote w:type="separator" w:id="-1">
+    <w:p>
+      <w:pPr>
+        <w:spacing w:line="240" w:lineRule="auto"/>
+      </w:pPr>
+      <w:r>
+        <w:separator/>
+      </w:r>
+    </w:p>
+  </w:endnote>
+  <w:endnote w:type="continuationSeparator" w:id="0">
+    <w:p>
+      <w:pPr>
+        <w:spacing w:line="240" w:lineRule="auto"/>
+      </w:pPr>
+      <w:r>
+        <w:continuationSeparator/>
+      </w:r>
+    </w:p>
+  </w:endnote>
+</w:endnotes>
+</file>
+
+<file path=word/footnotes.xml><?xml version="1.0" encoding="utf-8"?>
+<w:footnotes xmlns:wpc="http://schemas.microsoft.com/office/word/2010/wordprocessingCanvas" xmlns:cx="http://schemas.microsoft.com/office/drawing/2014/chartex" xmlns:cx1="http://schemas.microsoft.com/office/drawing/2015/9/8/chartex" xmlns:cx2="http://schemas.microsoft.com/office/drawing/2015/10/21/chartex" xmlns:cx3="http://schemas.microsoft.com/office/drawing/2016/5/9/chartex" xmlns:cx4="http://schemas.microsoft.com/office/drawing/2016/5/10/chartex" xmlns:cx5="http://schemas.microsoft.com/office/drawing/2016/5/11/chartex" xmlns:cx6="http://schemas.microsoft.com/office/drawing/2016/5/12/chartex" xmlns:cx7="http://schemas.microsoft.com/office/drawing/2016/5/13/chartex" xmlns:cx8="http://schemas.microsoft.com/office/drawing/2016/5/14/chartex" xmlns:mc="http://schemas.openxmlformats.org/markup-compatibility/2006" xmlns:aink="http://schemas.microsoft.com/office/drawing/2016/ink" xmlns:am3d="http://schemas.microsoft.com/office/drawing/2017/model3d" xmlns:o="urn:schemas-microsoft-com:office:office" xmlns:r="http://schemas.openxmlformats.org/officeDocument/2006/relationships" xmlns:m="http://schemas.openxmlformats.org/officeDocument/2006/math" xmlns:v="urn:schemas-microsoft-com:vml" xmlns:wp14="http://schemas.microsoft.com/office/word/2010/wordprocessingDrawing" xmlns:wp="http://schemas.openxmlformats.org/drawingml/2006/wordprocessingDrawing" xmlns:w10="urn:schemas-microsoft-com:office:word" xmlns:w="http://schemas.openxmlformats.org/wordprocessingml/2006/main" xmlns:w14="http://schemas.microsoft.com/office/word/2010/wordml" xmlns:w15="http://schemas.microsoft.com/office/word/2012/wordml" xmlns:w16cid="http://schemas.microsoft.com/office/word/2016/wordml/cid" xmlns:w16se="http://schemas.microsoft.com/office/word/2015/wordml/symex" xmlns:wpg="http://schemas.microsoft.com/office/word/2010/wordprocessingGroup" xmlns:wpi="http://schemas.microsoft.com/office/word/2010/wordprocessingInk" xmlns:wne="http://schemas.microsoft.com/office/word/2006/wordml" xmlns:wps="http://schemas.microsoft.com/office/word/2010/wordprocessingShape" mc:Ignorable="w14 w15 w16se w16cid wp14">
+  <w:footnote w:type="separator" w:id="-1">
+    <w:p>
+      <w:pPr>
+        <w:spacing w:line="240" w:lineRule="auto"/>
+      </w:pPr>
+      <w:r>
+        <w:separator/>
+      </w:r>
+    </w:p>
+  </w:footnote>
+  <w:footnote w:type="continuationSeparator" w:id="0">
+    <w:p>
+      <w:pPr>
+        <w:spacing w:line="240" w:lineRule="auto"/>
+      </w:pPr>
+      <w:r>
+        <w:continuationSeparator/>
+      </w:r>
+    </w:p>
+  </w:footnote>
+</w:footnotes>
 </file>
 
 <file path=word/styles.xml><?xml version="1.0" encoding="utf-8"?>
@@ -998,6 +1357,50 @@
     <w:semiHidden/>
     <w:unhideWhenUsed/>
   </w:style>
+  <w:style w:type="paragraph" w:styleId="Header">
+    <w:name w:val="header"/>
+    <w:basedOn w:val="Normal"/>
+    <w:link w:val="HeaderChar"/>
+    <w:uiPriority w:val="99"/>
+    <w:unhideWhenUsed/>
+    <w:rsid w:val="00831CE4"/>
+    <w:pPr>
+      <w:tabs>
+        <w:tab w:val="center" w:pos="4680"/>
+        <w:tab w:val="right" w:pos="9360"/>
+      </w:tabs>
+      <w:spacing w:line="240" w:lineRule="auto"/>
+    </w:pPr>
+  </w:style>
+  <w:style w:type="character" w:customStyle="1" w:styleId="HeaderChar">
+    <w:name w:val="Header Char"/>
+    <w:basedOn w:val="DefaultParagraphFont"/>
+    <w:link w:val="Header"/>
+    <w:uiPriority w:val="99"/>
+    <w:rsid w:val="00831CE4"/>
+  </w:style>
+  <w:style w:type="paragraph" w:styleId="Footer">
+    <w:name w:val="footer"/>
+    <w:basedOn w:val="Normal"/>
+    <w:link w:val="FooterChar"/>
+    <w:uiPriority w:val="99"/>
+    <w:unhideWhenUsed/>
+    <w:rsid w:val="00831CE4"/>
+    <w:pPr>
+      <w:tabs>
+        <w:tab w:val="center" w:pos="4680"/>
+        <w:tab w:val="right" w:pos="9360"/>
+      </w:tabs>
+      <w:spacing w:line="240" w:lineRule="auto"/>
+    </w:pPr>
+  </w:style>
+  <w:style w:type="character" w:customStyle="1" w:styleId="FooterChar">
+    <w:name w:val="Footer Char"/>
+    <w:basedOn w:val="DefaultParagraphFont"/>
+    <w:link w:val="Footer"/>
+    <w:uiPriority w:val="99"/>
+    <w:rsid w:val="00831CE4"/>
+  </w:style>
 </w:styles>
 </file>
 

</xml_diff>